<commit_message>
docs: publica binarios finais V1.1
</commit_message>
<xml_diff>
--- a/01_Plano_Gerenciamento_Unificado_Safe_Student.docx
+++ b/01_Plano_Gerenciamento_Unificado_Safe_Student.docx
@@ -312,11 +312,56 @@
     </w:p>
     <w:p>
       <w:pPr>
-        <w:spacing w:after="0"/>
+        <w:spacing w:after="0" w:before="0" w:line="240" w:lineRule="auto"/>
         <w:ind w:left="283"/>
+        <w:jc w:val="left"/>
       </w:pPr>
       <w:r>
-        <w:t>1. Resumo executivo</w:t>
+        <w:rPr>
+          <w:rFonts w:ascii="Times New Roman" w:hAnsi="Times New Roman"/>
+          <w:sz w:val="24"/>
+        </w:rPr>
+        <w:t>1 RESUMO EXECUTIVO  ········  4</w:t>
+        <w:br/>
+        <w:t>2 INTRODUÇÃO E JUSTIFICATIVA  ········  4</w:t>
+        <w:br/>
+        <w:t>3 ANÁLISE DE MERCADO  ········  5</w:t>
+        <w:br/>
+        <w:t>4 PERFIL DOS USUÁRIOS E PESQUISA EM CAMPO  ········  7</w:t>
+        <w:br/>
+        <w:t>5 PROTÓTIPOS DE BAIXA E MÉDIA FIDELIDADE  ········  8</w:t>
+        <w:br/>
+        <w:t>6 PROTÓTIPOS DE MÉDIA/ALTA FIDELIDADE  ········  8</w:t>
+        <w:br/>
+        <w:t>7 PROJECT CANVAS  ········  8</w:t>
+        <w:br/>
+        <w:t>8 GERENCIAMENTO DO ESCOPO  ········  9</w:t>
+        <w:br/>
+        <w:t>9 GERENCIAMENTO DO TEMPO  ········  10</w:t>
+        <w:br/>
+        <w:t>10 EQUIPE  ········  12</w:t>
+        <w:br/>
+        <w:t>11 GERENCIAMENTO DAS COMUNICAÇÕES  ········  12</w:t>
+        <w:br/>
+        <w:t>12 PARTES INTERESSADAS  ········  12</w:t>
+        <w:br/>
+        <w:t>13 GERENCIAMENTO DOS RISCOS  ········  13</w:t>
+        <w:br/>
+        <w:t>14 MONITORAMENTO E CONTROLE  ········  14</w:t>
+        <w:br/>
+        <w:t>15 CONTROLE INTEGRADO DE MUDANÇAS  ········  14</w:t>
+        <w:br/>
+        <w:t>16 LIÇÕES APRENDIDAS  ········  14</w:t>
+        <w:br/>
+        <w:t>17 FUNCIONALIDADES ESSENCIAIS DO MVP  ········  14</w:t>
+        <w:br/>
+        <w:t>18 CUSTOS, RECURSOS, INFRAESTRUTURA E AQUISIÇÕES  ········  15</w:t>
+        <w:br/>
+        <w:t>19 CRITÉRIOS DE APROVAÇÃO  ········  15</w:t>
+        <w:br/>
+        <w:t>20 ADEQUAÇÃO ÀS NORMAS E DOCUMENTOS DE REFERÊNCIA  ········  15</w:t>
+        <w:br/>
+        <w:t>REFERÊNCIAS  ········  16</w:t>
       </w:r>
     </w:p>
     <w:p>

</xml_diff>

<commit_message>
docs: publica pacote acadêmico V2 revisado
</commit_message>
<xml_diff>
--- a/01_Plano_Gerenciamento_Unificado_Safe_Student.docx
+++ b/01_Plano_Gerenciamento_Unificado_Safe_Student.docx
@@ -2088,10 +2088,10 @@
           <w:p>
             <w:r>
               <w:rPr>
-                <w:rFonts w:ascii="Arial" w:hAnsi="Arial"/>
+                <w:rFonts w:ascii="Times New Roman" w:hAnsi="Times New Roman"/>
                 <w:sz w:val="18"/>
               </w:rPr>
-              <w:t>15 participantes: 10 responsáveis, 3 colaboradores de portaria e 2 gestores.</w:t>
+              <w:t>Resultados históricos declarados na versão anterior; a evidência primária não foi localizada no repositório. Não apresentar quantitativo como validado sem anexar formulários ou CSV verificável.</w:t>
             </w:r>
           </w:p>
         </w:tc>
@@ -2122,16 +2122,12 @@
             <w:vAlign w:val="center"/>
           </w:tcPr>
           <w:p>
-            <w:pPr>
-              <w:spacing w:after="0"/>
-            </w:pPr>
-            <w:r/>
-            <w:r>
-              <w:rPr>
-                <w:b w:val="0"/>
+            <w:r>
+              <w:rPr>
+                <w:rFonts w:ascii="Times New Roman" w:hAnsi="Times New Roman"/>
                 <w:sz w:val="18"/>
               </w:rPr>
-              <w:t>13/15 concluíram sem ajuda.</w:t>
+              <w:t>Pendente de comprovação primária ou de nova coleta controlada.</w:t>
             </w:r>
           </w:p>
         </w:tc>
@@ -2162,16 +2158,12 @@
             <w:vAlign w:val="center"/>
           </w:tcPr>
           <w:p>
-            <w:pPr>
-              <w:spacing w:after="0"/>
-            </w:pPr>
-            <w:r/>
-            <w:r>
-              <w:rPr>
-                <w:b w:val="0"/>
+            <w:r>
+              <w:rPr>
+                <w:rFonts w:ascii="Times New Roman" w:hAnsi="Times New Roman"/>
                 <w:sz w:val="18"/>
               </w:rPr>
-              <w:t>5/5 operadores concluíram o fluxo.</w:t>
+              <w:t>Pendente de comprovação primária ou de nova coleta controlada.</w:t>
             </w:r>
           </w:p>
         </w:tc>
@@ -2202,16 +2194,12 @@
             <w:vAlign w:val="center"/>
           </w:tcPr>
           <w:p>
-            <w:pPr>
-              <w:spacing w:after="0"/>
-            </w:pPr>
-            <w:r/>
-            <w:r>
-              <w:rPr>
-                <w:b w:val="0"/>
+            <w:r>
+              <w:rPr>
+                <w:rFonts w:ascii="Times New Roman" w:hAnsi="Times New Roman"/>
                 <w:sz w:val="18"/>
               </w:rPr>
-              <w:t>14/15 declararam entendimento adequado.</w:t>
+              <w:t>Pendente de comprovação primária ou de nova coleta controlada.</w:t>
             </w:r>
           </w:p>
         </w:tc>
@@ -2242,16 +2230,12 @@
             <w:vAlign w:val="center"/>
           </w:tcPr>
           <w:p>
-            <w:pPr>
-              <w:spacing w:after="0"/>
-            </w:pPr>
-            <w:r/>
-            <w:r>
-              <w:rPr>
-                <w:b w:val="0"/>
+            <w:r>
+              <w:rPr>
+                <w:rFonts w:ascii="Times New Roman" w:hAnsi="Times New Roman"/>
                 <w:sz w:val="18"/>
               </w:rPr>
-              <w:t>Média 4,4 em escala de 1 a 5.</w:t>
+              <w:t>Pendente de comprovação primária. A nova coleta deve registrar nota individual no módulo Feedback.</w:t>
             </w:r>
           </w:p>
         </w:tc>
@@ -2282,16 +2266,12 @@
             <w:vAlign w:val="center"/>
           </w:tcPr>
           <w:p>
-            <w:pPr>
-              <w:spacing w:after="0"/>
-            </w:pPr>
-            <w:r/>
-            <w:r>
-              <w:rPr>
-                <w:b w:val="0"/>
+            <w:r>
+              <w:rPr>
+                <w:rFonts w:ascii="Times New Roman" w:hAnsi="Times New Roman"/>
                 <w:sz w:val="18"/>
               </w:rPr>
-              <w:t>Adicionar filtro por período e mensagem automática configurável.</w:t>
+              <w:t>A nova coleta deve registrar cenário, conclusão da tarefa, tempo, nota e comentário; somente dados APRESENTACAO podem ser tratados como evidência coletada.</w:t>
             </w:r>
           </w:p>
         </w:tc>
@@ -3417,10 +3397,10 @@
           <w:p>
             <w:r>
               <w:rPr>
-                <w:rFonts w:ascii="Arial" w:hAnsi="Arial"/>
+                <w:rFonts w:ascii="Times New Roman" w:hAnsi="Times New Roman"/>
                 <w:sz w:val="18"/>
               </w:rPr>
-              <w:t>Validar 5 funcionalidades essenciais e 15 RF/RNF com testes automatizados e avaliação acadêmica controlada de usabilidade.</w:t>
+              <w:t>Validar 5 funcionalidades essenciais e requisitos funcionais e não funcionais rastreáveis com testes automatizados e avaliação acadêmica controlada de usabilidade.</w:t>
             </w:r>
           </w:p>
         </w:tc>

</xml_diff>